<commit_message>
updated criteria 1.56 in prodoc appraisal
</commit_message>
<xml_diff>
--- a/Informe_Final_Consultoría_OIT_PO40551829.docx
+++ b/Informe_Final_Consultoría_OIT_PO40551829.docx
@@ -71,7 +71,7 @@
               <w:rPr>
                 <w:sz w:val="19"/>
               </w:rPr>
-              <w:t>Oficina Internacional del Trabajo (OIT) – Oficina Regional para América Latina y el Caribe</w:t>
+              <w:t>Organización Internacional del Trabajo (OIT) – Oficina Regional para América Latina y el Caribe</w:t>
             </w:r>
           </w:p>
         </w:tc>
@@ -379,7 +379,7 @@
         <w:rPr>
           <w:sz w:val="21"/>
         </w:rPr>
-        <w:t xml:space="preserve"> GPT de valoración preliminar de calidad (Tab 1 v3), GPT de diagnóstico de sostenibilidad (Tab 3) y GPT de clasificación de recomendaciones, todos con backend FastAPI desplegado en Render.</w:t>
+        <w:t xml:space="preserve"> GPT de valoración preliminar de calidad (Tab 1 v3), GPT de diagnóstico de sostenibilidad (Tab 3) y GPT de diagnóstico de atributos específicos (Tab 2), todos con backend FastAPI desplegado en Render.</w:t>
       </w:r>
     </w:p>
     <w:p>
@@ -2110,7 +2110,26 @@
         <w:rPr>
           <w:sz w:val="21"/>
         </w:rPr>
-        <w:t xml:space="preserve"> ILO PRODOC Quality Appraisal v3</w:t>
+        <w:t xml:space="preserve"> ILO PRODOC Quality Appraisal</w:t>
+      </w:r>
+    </w:p>
+    <w:p>
+      <w:pPr>
+        <w:pStyle w:val="ListBullet"/>
+        <w:spacing w:after="60"/>
+      </w:pPr>
+      <w:r>
+        <w:rPr>
+          <w:b/>
+          <w:sz w:val="21"/>
+        </w:rPr>
+        <w:t>Enlace:</w:t>
+      </w:r>
+      <w:r>
+        <w:rPr>
+          <w:sz w:val="21"/>
+        </w:rPr>
+        <w:t xml:space="preserve"> https://chatgpt.com/g/g-6a2643b11e708191adc1c03e64260a25-ilo-prodoc-quality-appraisal</w:t>
       </w:r>
     </w:p>
     <w:p>
@@ -2180,6 +2199,44 @@
           <w:b/>
           <w:sz w:val="21"/>
         </w:rPr>
+        <w:t>Escala:</w:t>
+      </w:r>
+      <w:r>
+        <w:rPr>
+          <w:sz w:val="21"/>
+        </w:rPr>
+        <w:t xml:space="preserve"> Yes / Partial / No / Not Found / N/A por criterio</w:t>
+      </w:r>
+    </w:p>
+    <w:p>
+      <w:pPr>
+        <w:pStyle w:val="ListBullet"/>
+        <w:spacing w:after="60"/>
+      </w:pPr>
+      <w:r>
+        <w:rPr>
+          <w:b/>
+          <w:sz w:val="21"/>
+        </w:rPr>
+        <w:t>Estabilidad:</w:t>
+      </w:r>
+      <w:r>
+        <w:rPr>
+          <w:sz w:val="21"/>
+        </w:rPr>
+        <w:t xml:space="preserve"> 10 corridas por criterio (STABILITY_REPEATS) consolidadas por moda, umbral de 80%; del orden de 760 llamadas al modelo en una valoración completa</w:t>
+      </w:r>
+    </w:p>
+    <w:p>
+      <w:pPr>
+        <w:pStyle w:val="ListBullet"/>
+        <w:spacing w:after="60"/>
+      </w:pPr>
+      <w:r>
+        <w:rPr>
+          <w:b/>
+          <w:sz w:val="21"/>
+        </w:rPr>
         <w:t>Modelo:</w:t>
       </w:r>
       <w:r>
@@ -2205,7 +2262,7 @@
         <w:rPr>
           <w:sz w:val="21"/>
         </w:rPr>
-        <w:t xml:space="preserve"> Publicado, acceso por enlace, backend operativo en https://ilo-prodoc-appraisal-v3.onrender.com</w:t>
+        <w:t xml:space="preserve"> Publicado con visibilidad "Anyone with a link"; backend operativo en https://ilo-prodoc-appraisal-v3.onrender.com</w:t>
       </w:r>
     </w:p>
     <w:p/>
@@ -2237,7 +2294,26 @@
         <w:rPr>
           <w:sz w:val="21"/>
         </w:rPr>
-        <w:t xml:space="preserve"> ILO PRODOC Sustainability Diagnosis</w:t>
+        <w:t xml:space="preserve"> OIT - Diagnóstico de Sostenibilidad del Proyecto</w:t>
+      </w:r>
+    </w:p>
+    <w:p>
+      <w:pPr>
+        <w:pStyle w:val="ListBullet"/>
+        <w:spacing w:after="60"/>
+      </w:pPr>
+      <w:r>
+        <w:rPr>
+          <w:b/>
+          <w:sz w:val="21"/>
+        </w:rPr>
+        <w:t>Enlace:</w:t>
+      </w:r>
+      <w:r>
+        <w:rPr>
+          <w:sz w:val="21"/>
+        </w:rPr>
+        <w:t xml:space="preserve"> https://chatgpt.com/g/g-6a43d24307b88191bb362632f133c0f3-oit-diagnostico-de-sostenibilidad-del-proyecto</w:t>
       </w:r>
     </w:p>
     <w:p>
@@ -2294,7 +2370,26 @@
         <w:rPr>
           <w:sz w:val="21"/>
         </w:rPr>
-        <w:t xml:space="preserve"> 0–3 por indicador, con dimensiones Diseño, Implementación y Evaluación</w:t>
+        <w:t xml:space="preserve"> 0–3 por indicador, con dimensiones Diseño, Implementación y Pre-Cierre</w:t>
+      </w:r>
+    </w:p>
+    <w:p>
+      <w:pPr>
+        <w:pStyle w:val="ListBullet"/>
+        <w:spacing w:after="60"/>
+      </w:pPr>
+      <w:r>
+        <w:rPr>
+          <w:b/>
+          <w:sz w:val="21"/>
+        </w:rPr>
+        <w:t>Estabilidad:</w:t>
+      </w:r>
+      <w:r>
+        <w:rPr>
+          <w:sz w:val="21"/>
+        </w:rPr>
+        <w:t xml:space="preserve"> Esquema de 5 corridas por indicador consolidadas por moda, con porcentaje de estabilidad reportado en el XLSX</w:t>
       </w:r>
     </w:p>
     <w:p>
@@ -2332,7 +2427,7 @@
         <w:rPr>
           <w:sz w:val="21"/>
         </w:rPr>
-        <w:t xml:space="preserve"> Publicado, acceso por enlace, mismo backend compartido</w:t>
+        <w:t xml:space="preserve"> Publicado con visibilidad "Anyone with a link"; mismo backend compartido</w:t>
       </w:r>
     </w:p>
     <w:p/>
@@ -2345,7 +2440,7 @@
         <w:rPr>
           <w:color w:val="003E7E"/>
         </w:rPr>
-        <w:t>5.3 GPT de Clasificación de Recomendaciones</w:t>
+        <w:t>5.3 GPT de Diagnóstico de Atributos Específicos (Tab 2)</w:t>
       </w:r>
     </w:p>
     <w:p>
@@ -2364,7 +2459,7 @@
         <w:rPr>
           <w:sz w:val="21"/>
         </w:rPr>
-        <w:t xml:space="preserve"> ILO Recommendations Classifier</w:t>
+        <w:t xml:space="preserve"> OIT - Diagnóstico de Atributos Específicos</w:t>
       </w:r>
     </w:p>
     <w:p>
@@ -2377,13 +2472,13 @@
           <w:b/>
           <w:sz w:val="21"/>
         </w:rPr>
-        <w:t>Funcionalidad:</w:t>
+        <w:t>Enlace:</w:t>
       </w:r>
       <w:r>
         <w:rPr>
           <w:sz w:val="21"/>
         </w:rPr>
-        <w:t xml:space="preserve"> Clasifica, prioriza y analiza recomendaciones de evaluaciones externas e internas</w:t>
+        <w:t xml:space="preserve"> https://chatgpt.com/g/g-6a43cc82d4d08191bf6e60357453e336-oit-diagnostico-de-atributos-especificos</w:t>
       </w:r>
     </w:p>
     <w:p>
@@ -2396,13 +2491,13 @@
           <w:b/>
           <w:sz w:val="21"/>
         </w:rPr>
-        <w:t>Idiomas:</w:t>
+        <w:t>Endpoint:</w:t>
       </w:r>
       <w:r>
         <w:rPr>
           <w:sz w:val="21"/>
         </w:rPr>
-        <w:t xml:space="preserve"> Español e inglés (tabs independientes)</w:t>
+        <w:t xml:space="preserve"> POST /attributes/jobs → GET /attributes/jobs/{id} → GET /attributes/jobs/{id}/result</w:t>
       </w:r>
     </w:p>
     <w:p>
@@ -2415,13 +2510,70 @@
           <w:b/>
           <w:sz w:val="21"/>
         </w:rPr>
-        <w:t>Salida:</w:t>
+        <w:t>Motor:</w:t>
       </w:r>
       <w:r>
         <w:rPr>
           <w:sz w:val="21"/>
         </w:rPr>
-        <w:t xml:space="preserve"> XLSX enriquecida con clasificación, prioridad sugerida y síntesis por área temática</w:t>
+        <w:t xml:space="preserve"> tab2_core.py + Rubricas_6ago2025.xlsx</w:t>
+      </w:r>
+    </w:p>
+    <w:p>
+      <w:pPr>
+        <w:pStyle w:val="ListBullet"/>
+        <w:spacing w:after="60"/>
+      </w:pPr>
+      <w:r>
+        <w:rPr>
+          <w:b/>
+          <w:sz w:val="21"/>
+        </w:rPr>
+        <w:t>Rúbricas seleccionables:</w:t>
+      </w:r>
+      <w:r>
+        <w:rPr>
+          <w:sz w:val="21"/>
+        </w:rPr>
+        <w:t xml:space="preserve"> métodos participativos, género o transición justa (una o varias por evaluación)</w:t>
+      </w:r>
+    </w:p>
+    <w:p>
+      <w:pPr>
+        <w:pStyle w:val="ListBullet"/>
+        <w:spacing w:after="60"/>
+      </w:pPr>
+      <w:r>
+        <w:rPr>
+          <w:b/>
+          <w:sz w:val="21"/>
+        </w:rPr>
+        <w:t>Escala:</w:t>
+      </w:r>
+      <w:r>
+        <w:rPr>
+          <w:sz w:val="21"/>
+        </w:rPr>
+        <w:t xml:space="preserve"> Puntuación 1–5 por criterio, con esquema de estabilidad de 5 corridas para reducir variabilidad del modelo</w:t>
+      </w:r>
+    </w:p>
+    <w:p>
+      <w:pPr>
+        <w:pStyle w:val="ListBullet"/>
+        <w:spacing w:after="60"/>
+      </w:pPr>
+      <w:r>
+        <w:rPr>
+          <w:b/>
+          <w:sz w:val="21"/>
+        </w:rPr>
+        <w:t>Modelo:</w:t>
+      </w:r>
+      <w:r>
+        <w:rPr>
+          <w:sz w:val="21"/>
+        </w:rPr>
+        <w:t xml:space="preserve"> gpt-5-mini; hasta 8 llamadas paralelas por corrida</w:t>
       </w:r>
     </w:p>
     <w:p>
@@ -2440,7 +2592,7 @@
         <w:rPr>
           <w:sz w:val="21"/>
         </w:rPr>
-        <w:t xml:space="preserve"> Publicado, acceso por enlace, integrado al mismo backend compartido</w:t>
+        <w:t xml:space="preserve"> Publicado con visibilidad "Anyone with a link"; integrado al mismo backend compartido</w:t>
       </w:r>
     </w:p>
     <w:p/>
@@ -3853,7 +4005,7 @@
               <w:rPr>
                 <w:sz w:val="19"/>
               </w:rPr>
-              <w:t>GPT Actions (valoración v3, sostenibilidad, recomendaciones) [valor añadido]</w:t>
+              <w:t>GPT Actions (valoración v3, sostenibilidad, atributos específicos) [valor añadido]</w:t>
             </w:r>
           </w:p>
         </w:tc>
@@ -4110,7 +4262,7 @@
               <w:rPr>
                 <w:sz w:val="19"/>
               </w:rPr>
-              <w:t>Enlace privado ChatGPT (solo personas con enlace)</w:t>
+              <w:t>https://chatgpt.com/g/g-6a2643b11e708191adc1c03e64260a25-ilo-prodoc-quality-appraisal</w:t>
             </w:r>
           </w:p>
         </w:tc>
@@ -4124,7 +4276,7 @@
               <w:rPr>
                 <w:sz w:val="19"/>
               </w:rPr>
-              <w:t>Requiere cuenta ChatGPT</w:t>
+              <w:t>Anyone with a link; requiere cuenta ChatGPT</w:t>
             </w:r>
           </w:p>
         </w:tc>
@@ -4154,7 +4306,7 @@
               <w:rPr>
                 <w:sz w:val="19"/>
               </w:rPr>
-              <w:t>Enlace privado ChatGPT (solo personas con enlace)</w:t>
+              <w:t>https://chatgpt.com/g/g-6a43d24307b88191bb362632f133c0f3-oit-diagnostico-de-sostenibilidad-del-proyecto</w:t>
             </w:r>
           </w:p>
         </w:tc>
@@ -4168,7 +4320,7 @@
               <w:rPr>
                 <w:sz w:val="19"/>
               </w:rPr>
-              <w:t>Requiere cuenta ChatGPT</w:t>
+              <w:t>Anyone with a link; requiere cuenta ChatGPT</w:t>
             </w:r>
           </w:p>
         </w:tc>
@@ -4184,7 +4336,7 @@
               <w:rPr>
                 <w:sz w:val="19"/>
               </w:rPr>
-              <w:t>GPT Recomendaciones</w:t>
+              <w:t>GPT Atributos Específicos</w:t>
             </w:r>
           </w:p>
         </w:tc>
@@ -4198,7 +4350,7 @@
               <w:rPr>
                 <w:sz w:val="19"/>
               </w:rPr>
-              <w:t>Enlace privado ChatGPT (solo personas con enlace)</w:t>
+              <w:t>https://chatgpt.com/g/g-6a43cc82d4d08191bf6e60357453e336-oit-diagnostico-de-atributos-especificos</w:t>
             </w:r>
           </w:p>
         </w:tc>
@@ -4212,7 +4364,7 @@
               <w:rPr>
                 <w:sz w:val="19"/>
               </w:rPr>
-              <w:t>Requiere cuenta ChatGPT</w:t>
+              <w:t>Anyone with a link; requiere cuenta ChatGPT</w:t>
             </w:r>
           </w:p>
         </w:tc>

</xml_diff>